<commit_message>
Add Spark environment section and execution screenshots
- New 'Spark Environment' section: versions, hardware, setup steps,
  terminal version check, History Server and Spark UI screenshots
- Appendix A: console excerpts and Spark jobs pages for all four runs
- Q1: request a 4 GB driver heap (the MinHash join ran out of memory at
  the 1 GB default under spark-submit) and sort tied LSH neighbours
- Rebuild report PDF/docx with embedded screenshots

Co-Authored-By: Claude Opus 5.5 <noreply@anthropic.com>
Claude-Session: https://claude.ai/code/session_01EJPmhL4RY2yD8h34GumFoA
</commit_message>
<xml_diff>
--- a/cosc611-midterm/COSC611_Midterm_Report.docx
+++ b/cosc611-midterm/COSC611_Midterm_Report.docx
@@ -600,7 +600,7 @@
           <w:bCs/>
           <w:b/>
         </w:rPr>
-        <w:t xml:space="preserve">Environment used to produce the outputs:</w:t>
+        <w:t xml:space="preserve">Environment:</w:t>
       </w:r>
       <w:r>
         <w:t xml:space="preserve"> </w:t>
@@ -621,74 +621,1302 @@
         <w:t xml:space="preserve"> </w:t>
       </w:r>
       <w:r>
-        <w:t xml:space="preserve">mode, Python 3.13, OpenJDK 21, SciPy 1.18 (used only to cross-check</w:t>
-      </w:r>
-      <w:r>
-        <w:t xml:space="preserve"> </w:t>
-      </w:r>
-      <w:r>
-        <w:t xml:space="preserve">p-values). Run each script from the</w:t>
-      </w:r>
-      <w:r>
-        <w:t xml:space="preserve"> </w:t>
-      </w:r>
-      <w:r>
-        <w:rPr>
-          <w:rStyle w:val="VerbatimChar"/>
-        </w:rPr>
-        <w:t xml:space="preserve">cosc611-midterm</w:t>
-      </w:r>
-      <w:r>
-        <w:t xml:space="preserve"> </w:t>
-      </w:r>
-      <w:r>
-        <w:t xml:space="preserve">folder with</w:t>
-      </w:r>
-      <w:r>
-        <w:t xml:space="preserve"> </w:t>
-      </w:r>
-      <w:r>
-        <w:rPr>
-          <w:rStyle w:val="VerbatimChar"/>
-        </w:rPr>
-        <w:t xml:space="preserve">spark-submit code/qN_*.py</w:t>
-      </w:r>
-      <w:r>
-        <w:t xml:space="preserve"> </w:t>
-      </w:r>
-      <w:r>
-        <w:t xml:space="preserve">or</w:t>
-      </w:r>
-      <w:r>
-        <w:t xml:space="preserve"> </w:t>
-      </w:r>
-      <w:r>
-        <w:rPr>
-          <w:rStyle w:val="VerbatimChar"/>
-        </w:rPr>
-        <w:t xml:space="preserve">python3 code/qN_*.py</w:t>
-      </w:r>
-      <w:r>
-        <w:t xml:space="preserve">. All numbers quoted below are</w:t>
-      </w:r>
-      <w:r>
-        <w:t xml:space="preserve"> </w:t>
-      </w:r>
-      <w:r>
-        <w:t xml:space="preserve">copied from the captured outputs.</w:t>
+        <w:t xml:space="preserve">mode, Python 3.13 and</w:t>
+      </w:r>
+      <w:r>
+        <w:t xml:space="preserve"> </w:t>
+      </w:r>
+      <w:r>
+        <w:t xml:space="preserve">OpenJDK 21. The next section,</w:t>
+      </w:r>
+      <w:r>
+        <w:t xml:space="preserve"> </w:t>
+      </w:r>
+      <w:r>
+        <w:rPr>
+          <w:bCs/>
+          <w:b/>
+        </w:rPr>
+        <w:t xml:space="preserve">Spark Environment</w:t>
+      </w:r>
+      <w:r>
+        <w:t xml:space="preserve">, gives the full setup with</w:t>
+      </w:r>
+      <w:r>
+        <w:t xml:space="preserve"> </w:t>
+      </w:r>
+      <w:r>
+        <w:t xml:space="preserve">screenshots, and Appendix A has screenshots of every run. All numbers quoted below</w:t>
+      </w:r>
+      <w:r>
+        <w:t xml:space="preserve"> </w:t>
+      </w:r>
+      <w:r>
+        <w:t xml:space="preserve">are copied from the captured outputs.</w:t>
       </w:r>
     </w:p>
     <w:bookmarkEnd w:id="20"/>
-    <w:bookmarkStart w:id="32" w:name="question-1-similarity-measures"/>
+    <w:bookmarkStart w:id="35" w:name="spark-environment"/>
     <w:p>
       <w:pPr>
         <w:pStyle w:val="Heading1"/>
       </w:pPr>
       <w:r>
+        <w:t xml:space="preserve">Spark Environment</w:t>
+      </w:r>
+    </w:p>
+    <w:bookmarkStart w:id="21" w:name="software-and-hardware"/>
+    <w:p>
+      <w:pPr>
+        <w:pStyle w:val="Heading2"/>
+      </w:pPr>
+      <w:r>
+        <w:t xml:space="preserve">Software and hardware</w:t>
+      </w:r>
+    </w:p>
+    <w:p>
+      <w:pPr>
+        <w:pStyle w:val="FirstParagraph"/>
+      </w:pPr>
+      <w:r>
+        <w:t xml:space="preserve">All four programs were run with</w:t>
+      </w:r>
+      <w:r>
+        <w:t xml:space="preserve"> </w:t>
+      </w:r>
+      <w:r>
+        <w:rPr>
+          <w:rStyle w:val="VerbatimChar"/>
+        </w:rPr>
+        <w:t xml:space="preserve">spark-submit</w:t>
+      </w:r>
+      <w:r>
+        <w:t xml:space="preserve"> </w:t>
+      </w:r>
+      <w:r>
+        <w:t xml:space="preserve">in Spark</w:t>
+      </w:r>
+      <w:r>
+        <w:t xml:space="preserve"> </w:t>
+      </w:r>
+      <w:r>
+        <w:rPr>
+          <w:bCs/>
+          <w:b/>
+        </w:rPr>
+        <w:t xml:space="preserve">local mode</w:t>
+      </w:r>
+      <w:r>
+        <w:t xml:space="preserve"> </w:t>
+      </w:r>
+      <w:r>
+        <w:t xml:space="preserve">(</w:t>
+      </w:r>
+      <w:r>
+        <w:rPr>
+          <w:rStyle w:val="VerbatimChar"/>
+        </w:rPr>
+        <w:t xml:space="preserve">local[*]</w:t>
+      </w:r>
+      <w:r>
+        <w:t xml:space="preserve">).</w:t>
+      </w:r>
+      <w:r>
+        <w:t xml:space="preserve"> </w:t>
+      </w:r>
+      <w:r>
+        <w:t xml:space="preserve">In local mode the driver and the executors run inside one JVM on one machine, using</w:t>
+      </w:r>
+      <w:r>
+        <w:t xml:space="preserve"> </w:t>
+      </w:r>
+      <w:r>
+        <w:t xml:space="preserve">every CPU core as a parallel task slot. The same code runs unchanged on a cluster</w:t>
+      </w:r>
+      <w:r>
+        <w:t xml:space="preserve"> </w:t>
+      </w:r>
+      <w:r>
+        <w:t xml:space="preserve">by changing the master URL, for example to YARN or Kubernetes.</w:t>
+      </w:r>
+    </w:p>
+    <w:tbl>
+      <w:tblPr>
+        <w:tblStyle w:val="Table"/>
+        <w:tblW w:type="auto" w:w="0"/>
+        <w:tblLook w:firstRow="1" w:lastRow="0" w:firstColumn="0" w:lastColumn="0" w:noHBand="0" w:noVBand="0" w:val="0020"/>
+        <w:jc w:val="start"/>
+      </w:tblPr>
+      <w:tblGrid>
+        <w:gridCol w:w="3960"/>
+        <w:gridCol w:w="3960"/>
+      </w:tblGrid>
+      <w:tr>
+        <w:trPr>
+          <w:tblHeader w:val="true"/>
+        </w:trPr>
+        <w:tc>
+          <w:tcPr/>
+          <w:p>
+            <w:pPr>
+              <w:pStyle w:val="Compact"/>
+              <w:jc w:val="left"/>
+            </w:pPr>
+            <w:r>
+              <w:t xml:space="preserve">Component</w:t>
+            </w:r>
+          </w:p>
+        </w:tc>
+        <w:tc>
+          <w:tcPr/>
+          <w:p>
+            <w:pPr>
+              <w:pStyle w:val="Compact"/>
+              <w:jc w:val="left"/>
+            </w:pPr>
+            <w:r>
+              <w:t xml:space="preserve">Version / value</w:t>
+            </w:r>
+          </w:p>
+        </w:tc>
+      </w:tr>
+      <w:tr>
+        <w:tc>
+          <w:tcPr/>
+          <w:p>
+            <w:pPr>
+              <w:pStyle w:val="Compact"/>
+              <w:jc w:val="left"/>
+            </w:pPr>
+            <w:r>
+              <w:t xml:space="preserve">Apache Spark (PySpark)</w:t>
+            </w:r>
+          </w:p>
+        </w:tc>
+        <w:tc>
+          <w:tcPr/>
+          <w:p>
+            <w:pPr>
+              <w:pStyle w:val="Compact"/>
+              <w:jc w:val="left"/>
+            </w:pPr>
+            <w:r>
+              <w:t xml:space="preserve">4.0.1, Scala 2.13.16</w:t>
+            </w:r>
+          </w:p>
+        </w:tc>
+      </w:tr>
+      <w:tr>
+        <w:tc>
+          <w:tcPr/>
+          <w:p>
+            <w:pPr>
+              <w:pStyle w:val="Compact"/>
+              <w:jc w:val="left"/>
+            </w:pPr>
+            <w:r>
+              <w:t xml:space="preserve">Java</w:t>
+            </w:r>
+          </w:p>
+        </w:tc>
+        <w:tc>
+          <w:tcPr/>
+          <w:p>
+            <w:pPr>
+              <w:pStyle w:val="Compact"/>
+              <w:jc w:val="left"/>
+            </w:pPr>
+            <w:r>
+              <w:t xml:space="preserve">OpenJDK 21.0.12.1 (64-bit Server VM)</w:t>
+            </w:r>
+          </w:p>
+        </w:tc>
+      </w:tr>
+      <w:tr>
+        <w:tc>
+          <w:tcPr/>
+          <w:p>
+            <w:pPr>
+              <w:pStyle w:val="Compact"/>
+              <w:jc w:val="left"/>
+            </w:pPr>
+            <w:r>
+              <w:t xml:space="preserve">Python</w:t>
+            </w:r>
+          </w:p>
+        </w:tc>
+        <w:tc>
+          <w:tcPr/>
+          <w:p>
+            <w:pPr>
+              <w:pStyle w:val="Compact"/>
+              <w:jc w:val="left"/>
+            </w:pPr>
+            <w:r>
+              <w:t xml:space="preserve">3.13.16</w:t>
+            </w:r>
+          </w:p>
+        </w:tc>
+      </w:tr>
+      <w:tr>
+        <w:tc>
+          <w:tcPr/>
+          <w:p>
+            <w:pPr>
+              <w:pStyle w:val="Compact"/>
+              <w:jc w:val="left"/>
+            </w:pPr>
+            <w:r>
+              <w:t xml:space="preserve">SciPy / NumPy</w:t>
+            </w:r>
+          </w:p>
+        </w:tc>
+        <w:tc>
+          <w:tcPr/>
+          <w:p>
+            <w:pPr>
+              <w:pStyle w:val="Compact"/>
+              <w:jc w:val="left"/>
+            </w:pPr>
+            <w:r>
+              <w:t xml:space="preserve">1.18.1 / 2.5.4 (p-value cross-checks only)</w:t>
+            </w:r>
+          </w:p>
+        </w:tc>
+      </w:tr>
+      <w:tr>
+        <w:tc>
+          <w:tcPr/>
+          <w:p>
+            <w:pPr>
+              <w:pStyle w:val="Compact"/>
+              <w:jc w:val="left"/>
+            </w:pPr>
+            <w:r>
+              <w:t xml:space="preserve">Operating system</w:t>
+            </w:r>
+          </w:p>
+        </w:tc>
+        <w:tc>
+          <w:tcPr/>
+          <w:p>
+            <w:pPr>
+              <w:pStyle w:val="Compact"/>
+              <w:jc w:val="left"/>
+            </w:pPr>
+            <w:r>
+              <w:t xml:space="preserve">Linux 6.18 x86_64 (virtual machine)</w:t>
+            </w:r>
+          </w:p>
+        </w:tc>
+      </w:tr>
+      <w:tr>
+        <w:tc>
+          <w:tcPr/>
+          <w:p>
+            <w:pPr>
+              <w:pStyle w:val="Compact"/>
+              <w:jc w:val="left"/>
+            </w:pPr>
+            <w:r>
+              <w:t xml:space="preserve">CPU cores / memory</w:t>
+            </w:r>
+          </w:p>
+        </w:tc>
+        <w:tc>
+          <w:tcPr/>
+          <w:p>
+            <w:pPr>
+              <w:pStyle w:val="Compact"/>
+              <w:jc w:val="left"/>
+            </w:pPr>
+            <w:r>
+              <w:t xml:space="preserve">4 cores / 15 GB RAM</w:t>
+            </w:r>
+          </w:p>
+        </w:tc>
+      </w:tr>
+      <w:tr>
+        <w:tc>
+          <w:tcPr/>
+          <w:p>
+            <w:pPr>
+              <w:pStyle w:val="Compact"/>
+              <w:jc w:val="left"/>
+            </w:pPr>
+            <w:r>
+              <w:t xml:space="preserve">Spark master</w:t>
+            </w:r>
+          </w:p>
+        </w:tc>
+        <w:tc>
+          <w:tcPr/>
+          <w:p>
+            <w:pPr>
+              <w:pStyle w:val="Compact"/>
+              <w:jc w:val="left"/>
+            </w:pPr>
+            <w:r>
+              <w:rPr>
+                <w:rStyle w:val="VerbatimChar"/>
+              </w:rPr>
+              <w:t xml:space="preserve">local[*]</w:t>
+            </w:r>
+            <w:r>
+              <w:t xml:space="preserve"> </w:t>
+            </w:r>
+            <w:r>
+              <w:t xml:space="preserve">(4 task slots)</w:t>
+            </w:r>
+          </w:p>
+        </w:tc>
+      </w:tr>
+      <w:tr>
+        <w:tc>
+          <w:tcPr/>
+          <w:p>
+            <w:pPr>
+              <w:pStyle w:val="Compact"/>
+              <w:jc w:val="left"/>
+            </w:pPr>
+            <w:r>
+              <w:t xml:space="preserve">Driver memory</w:t>
+            </w:r>
+          </w:p>
+        </w:tc>
+        <w:tc>
+          <w:tcPr/>
+          <w:p>
+            <w:pPr>
+              <w:pStyle w:val="Compact"/>
+              <w:jc w:val="left"/>
+            </w:pPr>
+            <w:r>
+              <w:t xml:space="preserve">4 GB (</w:t>
+            </w:r>
+            <w:r>
+              <w:rPr>
+                <w:rStyle w:val="VerbatimChar"/>
+              </w:rPr>
+              <w:t xml:space="preserve">--driver-memory 4g</w:t>
+            </w:r>
+            <w:r>
+              <w:t xml:space="preserve">)</w:t>
+            </w:r>
+          </w:p>
+        </w:tc>
+      </w:tr>
+      <w:tr>
+        <w:tc>
+          <w:tcPr/>
+          <w:p>
+            <w:pPr>
+              <w:pStyle w:val="Compact"/>
+              <w:jc w:val="left"/>
+            </w:pPr>
+            <w:r>
+              <w:t xml:space="preserve">Event logging</w:t>
+            </w:r>
+          </w:p>
+        </w:tc>
+        <w:tc>
+          <w:tcPr/>
+          <w:p>
+            <w:pPr>
+              <w:pStyle w:val="Compact"/>
+              <w:jc w:val="left"/>
+            </w:pPr>
+            <w:r>
+              <w:t xml:space="preserve">enabled, viewed with the Spark History Server</w:t>
+            </w:r>
+          </w:p>
+        </w:tc>
+      </w:tr>
+    </w:tbl>
+    <w:bookmarkEnd w:id="21"/>
+    <w:bookmarkStart w:id="34" w:name="setup-steps"/>
+    <w:p>
+      <w:pPr>
+        <w:pStyle w:val="Heading2"/>
+      </w:pPr>
+      <w:r>
+        <w:t xml:space="preserve">Setup steps</w:t>
+      </w:r>
+    </w:p>
+    <w:p>
+      <w:pPr>
+        <w:pStyle w:val="SourceCode"/>
+      </w:pPr>
+      <w:r>
+        <w:rPr>
+          <w:rStyle w:val="CommentTok"/>
+        </w:rPr>
+        <w:t xml:space="preserve"># 1. Java 17 or 21 must be installed (java -version)</w:t>
+      </w:r>
+      <w:r>
+        <w:br/>
+      </w:r>
+      <w:r>
+        <w:rPr>
+          <w:rStyle w:val="CommentTok"/>
+        </w:rPr>
+        <w:t xml:space="preserve"># 2. Create an isolated Python environment and install PySpark</w:t>
+      </w:r>
+      <w:r>
+        <w:br/>
+      </w:r>
+      <w:r>
+        <w:rPr>
+          <w:rStyle w:val="ExtensionTok"/>
+        </w:rPr>
+        <w:t xml:space="preserve">python3</w:t>
+      </w:r>
+      <w:r>
+        <w:rPr>
+          <w:rStyle w:val="NormalTok"/>
+        </w:rPr>
+        <w:t xml:space="preserve"> </w:t>
+      </w:r>
+      <w:r>
+        <w:rPr>
+          <w:rStyle w:val="AttributeTok"/>
+        </w:rPr>
+        <w:t xml:space="preserve">-m</w:t>
+      </w:r>
+      <w:r>
+        <w:rPr>
+          <w:rStyle w:val="NormalTok"/>
+        </w:rPr>
+        <w:t xml:space="preserve"> venv sparkenv </w:t>
+      </w:r>
+      <w:r>
+        <w:rPr>
+          <w:rStyle w:val="KeywordTok"/>
+        </w:rPr>
+        <w:t xml:space="preserve">&amp;&amp;</w:t>
+      </w:r>
+      <w:r>
+        <w:rPr>
+          <w:rStyle w:val="NormalTok"/>
+        </w:rPr>
+        <w:t xml:space="preserve"> </w:t>
+      </w:r>
+      <w:r>
+        <w:rPr>
+          <w:rStyle w:val="BuiltInTok"/>
+        </w:rPr>
+        <w:t xml:space="preserve">.</w:t>
+      </w:r>
+      <w:r>
+        <w:rPr>
+          <w:rStyle w:val="NormalTok"/>
+        </w:rPr>
+        <w:t xml:space="preserve"> sparkenv/bin/activate</w:t>
+      </w:r>
+      <w:r>
+        <w:br/>
+      </w:r>
+      <w:r>
+        <w:rPr>
+          <w:rStyle w:val="ExtensionTok"/>
+        </w:rPr>
+        <w:t xml:space="preserve">pip</w:t>
+      </w:r>
+      <w:r>
+        <w:rPr>
+          <w:rStyle w:val="NormalTok"/>
+        </w:rPr>
+        <w:t xml:space="preserve"> install pyspark==4.0.1 scipy numpy</w:t>
+      </w:r>
+      <w:r>
+        <w:br/>
+      </w:r>
+      <w:r>
+        <w:rPr>
+          <w:rStyle w:val="CommentTok"/>
+        </w:rPr>
+        <w:t xml:space="preserve"># 3. Turn on event logging so finished jobs can be inspected later</w:t>
+      </w:r>
+      <w:r>
+        <w:br/>
+      </w:r>
+      <w:r>
+        <w:rPr>
+          <w:rStyle w:val="CommentTok"/>
+        </w:rPr>
+        <w:t xml:space="preserve">#    ($SPARK_CONF_DIR/spark-defaults.conf)</w:t>
+      </w:r>
+      <w:r>
+        <w:br/>
+      </w:r>
+      <w:r>
+        <w:rPr>
+          <w:rStyle w:val="CommentTok"/>
+        </w:rPr>
+        <w:t xml:space="preserve">#      spark.eventLog.enabled         true</w:t>
+      </w:r>
+      <w:r>
+        <w:br/>
+      </w:r>
+      <w:r>
+        <w:rPr>
+          <w:rStyle w:val="CommentTok"/>
+        </w:rPr>
+        <w:t xml:space="preserve">#      spark.eventLog.dir             file:///path/to/events</w:t>
+      </w:r>
+      <w:r>
+        <w:br/>
+      </w:r>
+      <w:r>
+        <w:rPr>
+          <w:rStyle w:val="CommentTok"/>
+        </w:rPr>
+        <w:t xml:space="preserve">#      spark.history.fs.logDirectory  file:///path/to/events</w:t>
+      </w:r>
+      <w:r>
+        <w:br/>
+      </w:r>
+      <w:r>
+        <w:rPr>
+          <w:rStyle w:val="CommentTok"/>
+        </w:rPr>
+        <w:t xml:space="preserve"># 4. Run each question</w:t>
+      </w:r>
+      <w:r>
+        <w:br/>
+      </w:r>
+      <w:r>
+        <w:rPr>
+          <w:rStyle w:val="ExtensionTok"/>
+        </w:rPr>
+        <w:t xml:space="preserve">spark-submit</w:t>
+      </w:r>
+      <w:r>
+        <w:rPr>
+          <w:rStyle w:val="NormalTok"/>
+        </w:rPr>
+        <w:t xml:space="preserve"> </w:t>
+      </w:r>
+      <w:r>
+        <w:rPr>
+          <w:rStyle w:val="AttributeTok"/>
+        </w:rPr>
+        <w:t xml:space="preserve">--driver-memory</w:t>
+      </w:r>
+      <w:r>
+        <w:rPr>
+          <w:rStyle w:val="NormalTok"/>
+        </w:rPr>
+        <w:t xml:space="preserve"> 4g code/q1_similarity.py       </w:t>
+      </w:r>
+      <w:r>
+        <w:rPr>
+          <w:rStyle w:val="OperatorTok"/>
+        </w:rPr>
+        <w:t xml:space="preserve">&gt;</w:t>
+      </w:r>
+      <w:r>
+        <w:rPr>
+          <w:rStyle w:val="NormalTok"/>
+        </w:rPr>
+        <w:t xml:space="preserve"> outputs/q1_similarity.txt</w:t>
+      </w:r>
+      <w:r>
+        <w:br/>
+      </w:r>
+      <w:r>
+        <w:rPr>
+          <w:rStyle w:val="ExtensionTok"/>
+        </w:rPr>
+        <w:t xml:space="preserve">spark-submit</w:t>
+      </w:r>
+      <w:r>
+        <w:rPr>
+          <w:rStyle w:val="NormalTok"/>
+        </w:rPr>
+        <w:t xml:space="preserve"> </w:t>
+      </w:r>
+      <w:r>
+        <w:rPr>
+          <w:rStyle w:val="AttributeTok"/>
+        </w:rPr>
+        <w:t xml:space="preserve">--driver-memory</w:t>
+      </w:r>
+      <w:r>
+        <w:rPr>
+          <w:rStyle w:val="NormalTok"/>
+        </w:rPr>
+        <w:t xml:space="preserve"> 4g code/q2_hypothesis_tests.py </w:t>
+      </w:r>
+      <w:r>
+        <w:rPr>
+          <w:rStyle w:val="OperatorTok"/>
+        </w:rPr>
+        <w:t xml:space="preserve">&gt;</w:t>
+      </w:r>
+      <w:r>
+        <w:rPr>
+          <w:rStyle w:val="NormalTok"/>
+        </w:rPr>
+        <w:t xml:space="preserve"> outputs/q2_hypothesis_tests.txt</w:t>
+      </w:r>
+      <w:r>
+        <w:br/>
+      </w:r>
+      <w:r>
+        <w:rPr>
+          <w:rStyle w:val="ExtensionTok"/>
+        </w:rPr>
+        <w:t xml:space="preserve">spark-submit</w:t>
+      </w:r>
+      <w:r>
+        <w:rPr>
+          <w:rStyle w:val="NormalTok"/>
+        </w:rPr>
+        <w:t xml:space="preserve"> </w:t>
+      </w:r>
+      <w:r>
+        <w:rPr>
+          <w:rStyle w:val="AttributeTok"/>
+        </w:rPr>
+        <w:t xml:space="preserve">--driver-memory</w:t>
+      </w:r>
+      <w:r>
+        <w:rPr>
+          <w:rStyle w:val="NormalTok"/>
+        </w:rPr>
+        <w:t xml:space="preserve"> 4g code/q3_clustering.py       </w:t>
+      </w:r>
+      <w:r>
+        <w:rPr>
+          <w:rStyle w:val="OperatorTok"/>
+        </w:rPr>
+        <w:t xml:space="preserve">&gt;</w:t>
+      </w:r>
+      <w:r>
+        <w:rPr>
+          <w:rStyle w:val="NormalTok"/>
+        </w:rPr>
+        <w:t xml:space="preserve"> outputs/q3_clustering.txt</w:t>
+      </w:r>
+      <w:r>
+        <w:br/>
+      </w:r>
+      <w:r>
+        <w:rPr>
+          <w:rStyle w:val="ExtensionTok"/>
+        </w:rPr>
+        <w:t xml:space="preserve">spark-submit</w:t>
+      </w:r>
+      <w:r>
+        <w:rPr>
+          <w:rStyle w:val="NormalTok"/>
+        </w:rPr>
+        <w:t xml:space="preserve"> </w:t>
+      </w:r>
+      <w:r>
+        <w:rPr>
+          <w:rStyle w:val="AttributeTok"/>
+        </w:rPr>
+        <w:t xml:space="preserve">--driver-memory</w:t>
+      </w:r>
+      <w:r>
+        <w:rPr>
+          <w:rStyle w:val="NormalTok"/>
+        </w:rPr>
+        <w:t xml:space="preserve"> 4g code/q4_classification.py   </w:t>
+      </w:r>
+      <w:r>
+        <w:rPr>
+          <w:rStyle w:val="OperatorTok"/>
+        </w:rPr>
+        <w:t xml:space="preserve">&gt;</w:t>
+      </w:r>
+      <w:r>
+        <w:rPr>
+          <w:rStyle w:val="NormalTok"/>
+        </w:rPr>
+        <w:t xml:space="preserve"> outputs/q4_classification.txt</w:t>
+      </w:r>
+      <w:r>
+        <w:br/>
+      </w:r>
+      <w:r>
+        <w:rPr>
+          <w:rStyle w:val="CommentTok"/>
+        </w:rPr>
+        <w:t xml:space="preserve"># 5. Browse the finished applications at http://localhost:18080</w:t>
+      </w:r>
+      <w:r>
+        <w:br/>
+      </w:r>
+      <w:r>
+        <w:rPr>
+          <w:rStyle w:val="VariableTok"/>
+        </w:rPr>
+        <w:t xml:space="preserve">$SPARK_HOME</w:t>
+      </w:r>
+      <w:r>
+        <w:rPr>
+          <w:rStyle w:val="ExtensionTok"/>
+        </w:rPr>
+        <w:t xml:space="preserve">/sbin/start-history-server.sh</w:t>
+      </w:r>
+    </w:p>
+    <w:p>
+      <w:pPr>
+        <w:pStyle w:val="FirstParagraph"/>
+      </w:pPr>
+      <w:r>
+        <w:t xml:space="preserve">Q1 needs the 4 GB driver heap. With the default 1 GB, its MinHash similarity join</w:t>
+      </w:r>
+      <w:r>
+        <w:t xml:space="preserve"> </w:t>
+      </w:r>
+      <w:r>
+        <w:t xml:space="preserve">(about 1.4 million result pairs) failed with</w:t>
+      </w:r>
+      <w:r>
+        <w:t xml:space="preserve"> </w:t>
+      </w:r>
+      <w:r>
+        <w:rPr>
+          <w:rStyle w:val="VerbatimChar"/>
+        </w:rPr>
+        <w:t xml:space="preserve">java.lang.OutOfMemoryError: Java heap space</w:t>
+      </w:r>
+      <w:r>
+        <w:t xml:space="preserve">, so the driver memory was raised.</w:t>
+      </w:r>
+    </w:p>
+    <w:p>
+      <w:pPr>
+        <w:pStyle w:val="CaptionedFigure"/>
+      </w:pPr>
+      <w:r>
+        <w:drawing>
+          <wp:inline>
+            <wp:extent cx="5334000" cy="3168396"/>
+            <wp:effectExtent b="0" l="0" r="0" t="0"/>
+            <wp:docPr descr="Spark, Java and Python versions in the terminal" title="" id="23" name="Picture"/>
+            <a:graphic>
+              <a:graphicData uri="http://schemas.openxmlformats.org/drawingml/2006/picture">
+                <pic:pic>
+                  <pic:nvPicPr>
+                    <pic:cNvPr descr="screenshots/10_console_environment.png" id="24" name="Picture"/>
+                    <pic:cNvPicPr>
+                      <a:picLocks noChangeArrowheads="1" noChangeAspect="1"/>
+                    </pic:cNvPicPr>
+                  </pic:nvPicPr>
+                  <pic:blipFill>
+                    <a:blip r:embed="rId22"/>
+                    <a:stretch>
+                      <a:fillRect/>
+                    </a:stretch>
+                  </pic:blipFill>
+                  <pic:spPr bwMode="auto">
+                    <a:xfrm>
+                      <a:off x="0" y="0"/>
+                      <a:ext cx="5334000" cy="3168396"/>
+                    </a:xfrm>
+                    <a:prstGeom prst="rect">
+                      <a:avLst/>
+                    </a:prstGeom>
+                    <a:noFill/>
+                    <a:ln w="9525">
+                      <a:noFill/>
+                      <a:headEnd/>
+                      <a:tailEnd/>
+                    </a:ln>
+                  </pic:spPr>
+                </pic:pic>
+              </a:graphicData>
+            </a:graphic>
+          </wp:inline>
+        </w:drawing>
+      </w:r>
+    </w:p>
+    <w:p>
+      <w:pPr>
+        <w:pStyle w:val="ImageCaption"/>
+      </w:pPr>
+      <w:r>
+        <w:t xml:space="preserve">Spark, Java and Python versions in the terminal</w:t>
+      </w:r>
+    </w:p>
+    <w:p>
+      <w:pPr>
+        <w:pStyle w:val="CaptionedFigure"/>
+      </w:pPr>
+      <w:r>
+        <w:drawing>
+          <wp:inline>
+            <wp:extent cx="5334000" cy="1981200"/>
+            <wp:effectExtent b="0" l="0" r="0" t="0"/>
+            <wp:docPr descr="Spark History Server: the four completed applications, one per question" title="" id="26" name="Picture"/>
+            <a:graphic>
+              <a:graphicData uri="http://schemas.openxmlformats.org/drawingml/2006/picture">
+                <pic:pic>
+                  <pic:nvPicPr>
+                    <pic:cNvPr descr="screenshots/01_history_server_apps.png" id="27" name="Picture"/>
+                    <pic:cNvPicPr>
+                      <a:picLocks noChangeArrowheads="1" noChangeAspect="1"/>
+                    </pic:cNvPicPr>
+                  </pic:nvPicPr>
+                  <pic:blipFill>
+                    <a:blip r:embed="rId25"/>
+                    <a:stretch>
+                      <a:fillRect/>
+                    </a:stretch>
+                  </pic:blipFill>
+                  <pic:spPr bwMode="auto">
+                    <a:xfrm>
+                      <a:off x="0" y="0"/>
+                      <a:ext cx="5334000" cy="1981200"/>
+                    </a:xfrm>
+                    <a:prstGeom prst="rect">
+                      <a:avLst/>
+                    </a:prstGeom>
+                    <a:noFill/>
+                    <a:ln w="9525">
+                      <a:noFill/>
+                      <a:headEnd/>
+                      <a:tailEnd/>
+                    </a:ln>
+                  </pic:spPr>
+                </pic:pic>
+              </a:graphicData>
+            </a:graphic>
+          </wp:inline>
+        </w:drawing>
+      </w:r>
+    </w:p>
+    <w:p>
+      <w:pPr>
+        <w:pStyle w:val="ImageCaption"/>
+      </w:pPr>
+      <w:r>
+        <w:t xml:space="preserve">Spark History Server: the four completed applications, one per question</w:t>
+      </w:r>
+    </w:p>
+    <w:tbl>
+      <w:tblPr>
+        <w:tblStyle w:val="Table"/>
+        <w:tblW w:type="auto" w:w="0"/>
+        <w:tblLook w:firstRow="1" w:lastRow="0" w:firstColumn="0" w:lastColumn="0" w:noHBand="0" w:noVBand="0" w:val="0020"/>
+        <w:jc w:val="start"/>
+      </w:tblPr>
+      <w:tblGrid>
+        <w:gridCol w:w="1980"/>
+        <w:gridCol w:w="1980"/>
+        <w:gridCol w:w="1980"/>
+        <w:gridCol w:w="1980"/>
+      </w:tblGrid>
+      <w:tr>
+        <w:trPr>
+          <w:tblHeader w:val="true"/>
+        </w:trPr>
+        <w:tc>
+          <w:tcPr/>
+          <w:p>
+            <w:pPr>
+              <w:pStyle w:val="Compact"/>
+              <w:jc w:val="left"/>
+            </w:pPr>
+            <w:r>
+              <w:t xml:space="preserve">Application</w:t>
+            </w:r>
+          </w:p>
+        </w:tc>
+        <w:tc>
+          <w:tcPr/>
+          <w:p>
+            <w:pPr>
+              <w:pStyle w:val="Compact"/>
+              <w:jc w:val="left"/>
+            </w:pPr>
+            <w:r>
+              <w:t xml:space="preserve">Question</w:t>
+            </w:r>
+          </w:p>
+        </w:tc>
+        <w:tc>
+          <w:tcPr/>
+          <w:p>
+            <w:pPr>
+              <w:pStyle w:val="Compact"/>
+              <w:jc w:val="left"/>
+            </w:pPr>
+            <w:r>
+              <w:t xml:space="preserve">Duration</w:t>
+            </w:r>
+          </w:p>
+        </w:tc>
+        <w:tc>
+          <w:tcPr/>
+          <w:p>
+            <w:pPr>
+              <w:pStyle w:val="Compact"/>
+              <w:jc w:val="left"/>
+            </w:pPr>
+            <w:r>
+              <w:t xml:space="preserve">Spark jobs</w:t>
+            </w:r>
+          </w:p>
+        </w:tc>
+      </w:tr>
+      <w:tr>
+        <w:tc>
+          <w:tcPr/>
+          <w:p>
+            <w:pPr>
+              <w:pStyle w:val="Compact"/>
+              <w:jc w:val="left"/>
+            </w:pPr>
+            <w:r>
+              <w:t xml:space="preserve">Q1-Similarity</w:t>
+            </w:r>
+          </w:p>
+        </w:tc>
+        <w:tc>
+          <w:tcPr/>
+          <w:p>
+            <w:pPr>
+              <w:pStyle w:val="Compact"/>
+              <w:jc w:val="left"/>
+            </w:pPr>
+            <w:r>
+              <w:t xml:space="preserve">1</w:t>
+            </w:r>
+          </w:p>
+        </w:tc>
+        <w:tc>
+          <w:tcPr/>
+          <w:p>
+            <w:pPr>
+              <w:pStyle w:val="Compact"/>
+              <w:jc w:val="left"/>
+            </w:pPr>
+            <w:r>
+              <w:t xml:space="preserve">3.4 min</w:t>
+            </w:r>
+          </w:p>
+        </w:tc>
+        <w:tc>
+          <w:tcPr/>
+          <w:p>
+            <w:pPr>
+              <w:pStyle w:val="Compact"/>
+              <w:jc w:val="left"/>
+            </w:pPr>
+            <w:r>
+              <w:t xml:space="preserve">71</w:t>
+            </w:r>
+          </w:p>
+        </w:tc>
+      </w:tr>
+      <w:tr>
+        <w:tc>
+          <w:tcPr/>
+          <w:p>
+            <w:pPr>
+              <w:pStyle w:val="Compact"/>
+              <w:jc w:val="left"/>
+            </w:pPr>
+            <w:r>
+              <w:t xml:space="preserve">Q2-HypothesisTesting</w:t>
+            </w:r>
+          </w:p>
+        </w:tc>
+        <w:tc>
+          <w:tcPr/>
+          <w:p>
+            <w:pPr>
+              <w:pStyle w:val="Compact"/>
+              <w:jc w:val="left"/>
+            </w:pPr>
+            <w:r>
+              <w:t xml:space="preserve">2</w:t>
+            </w:r>
+          </w:p>
+        </w:tc>
+        <w:tc>
+          <w:tcPr/>
+          <w:p>
+            <w:pPr>
+              <w:pStyle w:val="Compact"/>
+              <w:jc w:val="left"/>
+            </w:pPr>
+            <w:r>
+              <w:t xml:space="preserve">18 s</w:t>
+            </w:r>
+          </w:p>
+        </w:tc>
+        <w:tc>
+          <w:tcPr/>
+          <w:p>
+            <w:pPr>
+              <w:pStyle w:val="Compact"/>
+              <w:jc w:val="left"/>
+            </w:pPr>
+            <w:r>
+              <w:t xml:space="preserve">137</w:t>
+            </w:r>
+          </w:p>
+        </w:tc>
+      </w:tr>
+      <w:tr>
+        <w:tc>
+          <w:tcPr/>
+          <w:p>
+            <w:pPr>
+              <w:pStyle w:val="Compact"/>
+              <w:jc w:val="left"/>
+            </w:pPr>
+            <w:r>
+              <w:t xml:space="preserve">Q3-Clustering</w:t>
+            </w:r>
+          </w:p>
+        </w:tc>
+        <w:tc>
+          <w:tcPr/>
+          <w:p>
+            <w:pPr>
+              <w:pStyle w:val="Compact"/>
+              <w:jc w:val="left"/>
+            </w:pPr>
+            <w:r>
+              <w:t xml:space="preserve">3</w:t>
+            </w:r>
+          </w:p>
+        </w:tc>
+        <w:tc>
+          <w:tcPr/>
+          <w:p>
+            <w:pPr>
+              <w:pStyle w:val="Compact"/>
+              <w:jc w:val="left"/>
+            </w:pPr>
+            <w:r>
+              <w:t xml:space="preserve">50 s</w:t>
+            </w:r>
+          </w:p>
+        </w:tc>
+        <w:tc>
+          <w:tcPr/>
+          <w:p>
+            <w:pPr>
+              <w:pStyle w:val="Compact"/>
+              <w:jc w:val="left"/>
+            </w:pPr>
+            <w:r>
+              <w:t xml:space="preserve">983</w:t>
+            </w:r>
+          </w:p>
+        </w:tc>
+      </w:tr>
+      <w:tr>
+        <w:tc>
+          <w:tcPr/>
+          <w:p>
+            <w:pPr>
+              <w:pStyle w:val="Compact"/>
+              <w:jc w:val="left"/>
+            </w:pPr>
+            <w:r>
+              <w:t xml:space="preserve">Q4-Classification</w:t>
+            </w:r>
+          </w:p>
+        </w:tc>
+        <w:tc>
+          <w:tcPr/>
+          <w:p>
+            <w:pPr>
+              <w:pStyle w:val="Compact"/>
+              <w:jc w:val="left"/>
+            </w:pPr>
+            <w:r>
+              <w:t xml:space="preserve">4</w:t>
+            </w:r>
+          </w:p>
+        </w:tc>
+        <w:tc>
+          <w:tcPr/>
+          <w:p>
+            <w:pPr>
+              <w:pStyle w:val="Compact"/>
+              <w:jc w:val="left"/>
+            </w:pPr>
+            <w:r>
+              <w:t xml:space="preserve">45 s</w:t>
+            </w:r>
+          </w:p>
+        </w:tc>
+        <w:tc>
+          <w:tcPr/>
+          <w:p>
+            <w:pPr>
+              <w:pStyle w:val="Compact"/>
+              <w:jc w:val="left"/>
+            </w:pPr>
+            <w:r>
+              <w:t xml:space="preserve">675</w:t>
+            </w:r>
+          </w:p>
+        </w:tc>
+      </w:tr>
+    </w:tbl>
+    <w:p>
+      <w:pPr>
+        <w:pStyle w:val="BodyText"/>
+      </w:pPr>
+      <w:r>
+        <w:t xml:space="preserve">Every job in all four applications finished with status SUCCEEDED.</w:t>
+      </w:r>
+    </w:p>
+    <w:p>
+      <w:pPr>
+        <w:pStyle w:val="CaptionedFigure"/>
+      </w:pPr>
+      <w:r>
+        <w:drawing>
+          <wp:inline>
+            <wp:extent cx="5334000" cy="5715000"/>
+            <wp:effectExtent b="0" l="0" r="0" t="0"/>
+            <wp:docPr descr="Spark UI Environment page for the Q1 run: Java 21, Scala 2.13, spark.master = local[*], spark.driver.memory = 4g, event logging on" title="" id="29" name="Picture"/>
+            <a:graphic>
+              <a:graphicData uri="http://schemas.openxmlformats.org/drawingml/2006/picture">
+                <pic:pic>
+                  <pic:nvPicPr>
+                    <pic:cNvPr descr="screenshots/03_q1_environment.png" id="30" name="Picture"/>
+                    <pic:cNvPicPr>
+                      <a:picLocks noChangeArrowheads="1" noChangeAspect="1"/>
+                    </pic:cNvPicPr>
+                  </pic:nvPicPr>
+                  <pic:blipFill>
+                    <a:blip r:embed="rId28"/>
+                    <a:stretch>
+                      <a:fillRect/>
+                    </a:stretch>
+                  </pic:blipFill>
+                  <pic:spPr bwMode="auto">
+                    <a:xfrm>
+                      <a:off x="0" y="0"/>
+                      <a:ext cx="5334000" cy="5715000"/>
+                    </a:xfrm>
+                    <a:prstGeom prst="rect">
+                      <a:avLst/>
+                    </a:prstGeom>
+                    <a:noFill/>
+                    <a:ln w="9525">
+                      <a:noFill/>
+                      <a:headEnd/>
+                      <a:tailEnd/>
+                    </a:ln>
+                  </pic:spPr>
+                </pic:pic>
+              </a:graphicData>
+            </a:graphic>
+          </wp:inline>
+        </w:drawing>
+      </w:r>
+    </w:p>
+    <w:p>
+      <w:pPr>
+        <w:pStyle w:val="ImageCaption"/>
+      </w:pPr>
+      <w:r>
+        <w:t xml:space="preserve">Spark UI Environment page for the Q1 run: Java 21, Scala 2.13, spark.master = local[*], spark.driver.memory = 4g, event logging on</w:t>
+      </w:r>
+    </w:p>
+    <w:p>
+      <w:pPr>
+        <w:pStyle w:val="CaptionedFigure"/>
+      </w:pPr>
+      <w:r>
+        <w:drawing>
+          <wp:inline>
+            <wp:extent cx="5334000" cy="2628900"/>
+            <wp:effectExtent b="0" l="0" r="0" t="0"/>
+            <wp:docPr descr="Spark UI Executors page for the Q1 run" title="" id="32" name="Picture"/>
+            <a:graphic>
+              <a:graphicData uri="http://schemas.openxmlformats.org/drawingml/2006/picture">
+                <pic:pic>
+                  <pic:nvPicPr>
+                    <pic:cNvPr descr="screenshots/04_q1_executors.png" id="33" name="Picture"/>
+                    <pic:cNvPicPr>
+                      <a:picLocks noChangeArrowheads="1" noChangeAspect="1"/>
+                    </pic:cNvPicPr>
+                  </pic:nvPicPr>
+                  <pic:blipFill>
+                    <a:blip r:embed="rId31"/>
+                    <a:stretch>
+                      <a:fillRect/>
+                    </a:stretch>
+                  </pic:blipFill>
+                  <pic:spPr bwMode="auto">
+                    <a:xfrm>
+                      <a:off x="0" y="0"/>
+                      <a:ext cx="5334000" cy="2628900"/>
+                    </a:xfrm>
+                    <a:prstGeom prst="rect">
+                      <a:avLst/>
+                    </a:prstGeom>
+                    <a:noFill/>
+                    <a:ln w="9525">
+                      <a:noFill/>
+                      <a:headEnd/>
+                      <a:tailEnd/>
+                    </a:ln>
+                  </pic:spPr>
+                </pic:pic>
+              </a:graphicData>
+            </a:graphic>
+          </wp:inline>
+        </w:drawing>
+      </w:r>
+    </w:p>
+    <w:p>
+      <w:pPr>
+        <w:pStyle w:val="ImageCaption"/>
+      </w:pPr>
+      <w:r>
+        <w:t xml:space="preserve">Spark UI Executors page for the Q1 run</w:t>
+      </w:r>
+    </w:p>
+    <w:p>
+      <w:pPr>
+        <w:pStyle w:val="BodyText"/>
+      </w:pPr>
+      <w:r>
+        <w:t xml:space="preserve">Screenshots of every question’s console output and Spark jobs are in</w:t>
+      </w:r>
+      <w:r>
+        <w:t xml:space="preserve"> </w:t>
+      </w:r>
+      <w:r>
+        <w:rPr>
+          <w:bCs/>
+          <w:b/>
+        </w:rPr>
+        <w:t xml:space="preserve">Appendix A</w:t>
+      </w:r>
+      <w:r>
+        <w:t xml:space="preserve">.</w:t>
+      </w:r>
+    </w:p>
+    <w:bookmarkEnd w:id="34"/>
+    <w:bookmarkEnd w:id="35"/>
+    <w:bookmarkStart w:id="47" w:name="question-1-similarity-measures"/>
+    <w:p>
+      <w:pPr>
+        <w:pStyle w:val="Heading1"/>
+      </w:pPr>
+      <w:r>
         <w:t xml:space="preserve">Question 1 — Similarity Measures</w:t>
       </w:r>
     </w:p>
-    <w:bookmarkStart w:id="21" w:name="what-is-a-similarity-measure"/>
+    <w:bookmarkStart w:id="36" w:name="what-is-a-similarity-measure"/>
     <w:p>
       <w:pPr>
         <w:pStyle w:val="Heading2"/>
@@ -1381,8 +2609,8 @@
         <w:t xml:space="preserve">.</w:t>
       </w:r>
     </w:p>
-    <w:bookmarkEnd w:id="21"/>
-    <w:bookmarkStart w:id="22" w:name="why-are-similarity-measures-necessary"/>
+    <w:bookmarkEnd w:id="36"/>
+    <w:bookmarkStart w:id="37" w:name="why-are-similarity-measures-necessary"/>
     <w:p>
       <w:pPr>
         <w:pStyle w:val="Heading2"/>
@@ -1682,8 +2910,8 @@
         <w:t xml:space="preserve">comparing every pair.</w:t>
       </w:r>
     </w:p>
-    <w:bookmarkEnd w:id="22"/>
-    <w:bookmarkStart w:id="23" w:name="example-data"/>
+    <w:bookmarkEnd w:id="37"/>
+    <w:bookmarkStart w:id="38" w:name="example-data"/>
     <w:p>
       <w:pPr>
         <w:pStyle w:val="Heading2"/>
@@ -2465,8 +3693,8 @@
         <w:t xml:space="preserve">or by mean-centring.</w:t>
       </w:r>
     </w:p>
-    <w:bookmarkEnd w:id="23"/>
-    <w:bookmarkStart w:id="29" w:name="X20a416e0e359564842796c499ef25769362fc56"/>
+    <w:bookmarkEnd w:id="38"/>
+    <w:bookmarkStart w:id="44" w:name="X20a416e0e359564842796c499ef25769362fc56"/>
     <w:p>
       <w:pPr>
         <w:pStyle w:val="Heading2"/>
@@ -2475,7 +3703,7 @@
         <w:t xml:space="preserve">1.4 Types of similarity measures, with computations</w:t>
       </w:r>
     </w:p>
-    <w:bookmarkStart w:id="24" w:name="a-euclidean-distance-l2"/>
+    <w:bookmarkStart w:id="39" w:name="a-euclidean-distance-l2"/>
     <w:p>
       <w:pPr>
         <w:pStyle w:val="Heading3"/>
@@ -2970,8 +4198,8 @@
         <w:t xml:space="preserve">dense, low-dimensional numeric data such as K-Means features.</w:t>
       </w:r>
     </w:p>
-    <w:bookmarkEnd w:id="24"/>
-    <w:bookmarkStart w:id="25" w:name="b-manhattan-distance-l1-city-block"/>
+    <w:bookmarkEnd w:id="39"/>
+    <w:bookmarkStart w:id="40" w:name="b-manhattan-distance-l1-city-block"/>
     <w:p>
       <w:pPr>
         <w:pStyle w:val="Heading3"/>
@@ -3183,8 +4411,8 @@
         <w:t xml:space="preserve">difference than Euclidean distance, so it is more robust to outliers.</w:t>
       </w:r>
     </w:p>
-    <w:bookmarkEnd w:id="25"/>
-    <w:bookmarkStart w:id="26" w:name="c-cosine-similarity"/>
+    <w:bookmarkEnd w:id="40"/>
+    <w:bookmarkStart w:id="41" w:name="c-cosine-similarity"/>
     <w:p>
       <w:pPr>
         <w:pStyle w:val="Heading3"/>
@@ -3789,8 +5017,8 @@
         <w:t xml:space="preserve">user’s ratings over 9,066 movies.</w:t>
       </w:r>
     </w:p>
-    <w:bookmarkEnd w:id="26"/>
-    <w:bookmarkStart w:id="27" w:name="d-pearson-correlation-coefficient"/>
+    <w:bookmarkEnd w:id="41"/>
+    <w:bookmarkStart w:id="42" w:name="d-pearson-correlation-coefficient"/>
     <w:p>
       <w:pPr>
         <w:pStyle w:val="Heading3"/>
@@ -4780,8 +6008,8 @@
         <w:t xml:space="preserve">means opposite tastes.</w:t>
       </w:r>
     </w:p>
-    <w:bookmarkEnd w:id="27"/>
-    <w:bookmarkStart w:id="28" w:name="e-jaccard-similarity-sets"/>
+    <w:bookmarkEnd w:id="42"/>
+    <w:bookmarkStart w:id="43" w:name="e-jaccard-similarity-sets"/>
     <w:p>
       <w:pPr>
         <w:pStyle w:val="Heading3"/>
@@ -5240,9 +6468,9 @@
         <w:t xml:space="preserve">.</w:t>
       </w:r>
     </w:p>
-    <w:bookmarkEnd w:id="28"/>
-    <w:bookmarkEnd w:id="29"/>
-    <w:bookmarkStart w:id="30" w:name="computation-on-spark"/>
+    <w:bookmarkEnd w:id="43"/>
+    <w:bookmarkEnd w:id="44"/>
+    <w:bookmarkStart w:id="45" w:name="computation-on-spark"/>
     <w:p>
       <w:pPr>
         <w:pStyle w:val="Heading2"/>
@@ -7518,13 +8746,13 @@
         <w:t xml:space="preserve"> </w:t>
       </w:r>
       <w:r>
-        <w:t xml:space="preserve">returns movies with exactly the same</w:t>
-      </w:r>
-      <w:r>
-        <w:t xml:space="preserve"> </w:t>
-      </w:r>
-      <w:r>
-        <w:t xml:space="preserve">genres (Jaccard distance 0), such as</w:t>
+        <w:t xml:space="preserve">returns six movies with exactly the</w:t>
+      </w:r>
+      <w:r>
+        <w:t xml:space="preserve"> </w:t>
+      </w:r>
+      <w:r>
+        <w:t xml:space="preserve">same genres (Jaccard distance 0). In the recorded run these were</w:t>
       </w:r>
       <w:r>
         <w:t xml:space="preserve"> </w:t>
@@ -7534,7 +8762,7 @@
           <w:iCs/>
           <w:i/>
         </w:rPr>
-        <w:t xml:space="preserve">The Terminator</w:t>
+        <w:t xml:space="preserve">Predator</w:t>
       </w:r>
       <w:r>
         <w:t xml:space="preserve">,</w:t>
@@ -7547,13 +8775,10 @@
           <w:iCs/>
           <w:i/>
         </w:rPr>
-        <w:t xml:space="preserve">Blade Runner</w:t>
-      </w:r>
-      <w:r>
-        <w:t xml:space="preserve"> </w:t>
-      </w:r>
-      <w:r>
-        <w:t xml:space="preserve">and</w:t>
+        <w:t xml:space="preserve">Predators</w:t>
+      </w:r>
+      <w:r>
+        <w:t xml:space="preserve">,</w:t>
       </w:r>
       <w:r>
         <w:t xml:space="preserve"> </w:t>
@@ -7563,10 +8788,64 @@
           <w:iCs/>
           <w:i/>
         </w:rPr>
-        <w:t xml:space="preserve">Equilibrium</w:t>
-      </w:r>
-      <w:r>
-        <w:t xml:space="preserve">.</w:t>
+        <w:t xml:space="preserve">Johnny Mnemonic</w:t>
+      </w:r>
+      <w:r>
+        <w:t xml:space="preserve">,</w:t>
+      </w:r>
+      <w:r>
+        <w:t xml:space="preserve"> </w:t>
+      </w:r>
+      <w:r>
+        <w:rPr>
+          <w:iCs/>
+          <w:i/>
+        </w:rPr>
+        <w:t xml:space="preserve">eXistenZ</w:t>
+      </w:r>
+      <w:r>
+        <w:t xml:space="preserve">,</w:t>
+      </w:r>
+      <w:r>
+        <w:t xml:space="preserve"> </w:t>
+      </w:r>
+      <w:r>
+        <w:rPr>
+          <w:iCs/>
+          <w:i/>
+        </w:rPr>
+        <w:t xml:space="preserve">Next</w:t>
+      </w:r>
+      <w:r>
+        <w:t xml:space="preserve"> </w:t>
+      </w:r>
+      <w:r>
+        <w:t xml:space="preserve">and</w:t>
+      </w:r>
+      <w:r>
+        <w:t xml:space="preserve"> </w:t>
+      </w:r>
+      <w:r>
+        <w:rPr>
+          <w:iCs/>
+          <w:i/>
+        </w:rPr>
+        <w:t xml:space="preserve">Surrogates</w:t>
+      </w:r>
+      <w:r>
+        <w:t xml:space="preserve">. Many movies</w:t>
+      </w:r>
+      <w:r>
+        <w:t xml:space="preserve"> </w:t>
+      </w:r>
+      <w:r>
+        <w:t xml:space="preserve">are tagged Action|Sci-Fi|Thriller, so all of them tie at distance 0, and which six</w:t>
+      </w:r>
+      <w:r>
+        <w:t xml:space="preserve"> </w:t>
+      </w:r>
+      <w:r>
+        <w:t xml:space="preserve">are returned can change from run to run.</w:t>
       </w:r>
     </w:p>
     <w:p>
@@ -7658,8 +8937,8 @@
         <w:t xml:space="preserve">.</w:t>
       </w:r>
     </w:p>
-    <w:bookmarkEnd w:id="30"/>
-    <w:bookmarkStart w:id="31" w:name="Xe3145cef8b21d3ff2dcbf46945ffbe3cf5a25ce"/>
+    <w:bookmarkEnd w:id="45"/>
+    <w:bookmarkStart w:id="46" w:name="Xe3145cef8b21d3ff2dcbf46945ffbe3cf5a25ce"/>
     <w:p>
       <w:pPr>
         <w:pStyle w:val="Heading2"/>
@@ -7973,9 +9252,9 @@
         <w:t xml:space="preserve">for sets or binary data.</w:t>
       </w:r>
     </w:p>
-    <w:bookmarkEnd w:id="31"/>
-    <w:bookmarkEnd w:id="32"/>
-    <w:bookmarkStart w:id="41" w:name="question-2-hypothesis-testing"/>
+    <w:bookmarkEnd w:id="46"/>
+    <w:bookmarkEnd w:id="47"/>
+    <w:bookmarkStart w:id="56" w:name="question-2-hypothesis-testing"/>
     <w:p>
       <w:pPr>
         <w:pStyle w:val="Heading1"/>
@@ -7984,7 +9263,7 @@
         <w:t xml:space="preserve">Question 2 — Hypothesis Testing</w:t>
       </w:r>
     </w:p>
-    <w:bookmarkStart w:id="33" w:name="what-is-hypothesis-testing"/>
+    <w:bookmarkStart w:id="48" w:name="what-is-hypothesis-testing"/>
     <w:p>
       <w:pPr>
         <w:pStyle w:val="Heading2"/>
@@ -8636,8 +9915,8 @@
         <w:t xml:space="preserve">specifies a direction.</w:t>
       </w:r>
     </w:p>
-    <w:bookmarkEnd w:id="33"/>
-    <w:bookmarkStart w:id="34" w:name="distinguishing-the-χ²-t-and-f-tests"/>
+    <w:bookmarkEnd w:id="48"/>
+    <w:bookmarkStart w:id="49" w:name="distinguishing-the-χ²-t-and-f-tests"/>
     <w:p>
       <w:pPr>
         <w:pStyle w:val="Heading2"/>
@@ -9869,8 +11148,8 @@
         <w:t xml:space="preserve">χ² variables.</w:t>
       </w:r>
     </w:p>
-    <w:bookmarkEnd w:id="34"/>
-    <w:bookmarkStart w:id="35" w:name="X3f976fd935ca78a0b2c6960662f7aae22ce09e4"/>
+    <w:bookmarkEnd w:id="49"/>
+    <w:bookmarkStart w:id="50" w:name="X3f976fd935ca78a0b2c6960662f7aae22ce09e4"/>
     <w:p>
       <w:pPr>
         <w:pStyle w:val="Heading2"/>
@@ -11610,8 +12889,8 @@
         <w:t xml:space="preserve">significant χ² shows association, not cause.</w:t>
       </w:r>
     </w:p>
-    <w:bookmarkEnd w:id="35"/>
-    <w:bookmarkStart w:id="36" w:name="students-t-test-the-sleep-data"/>
+    <w:bookmarkEnd w:id="50"/>
+    <w:bookmarkStart w:id="51" w:name="students-t-test-the-sleep-data"/>
     <w:p>
       <w:pPr>
         <w:pStyle w:val="Heading2"/>
@@ -13467,8 +14746,8 @@
         <w:t xml:space="preserve">(b) Spark-computed t = -4.0621, df = 9,  p = 0.002833  | scipy: t = -4.0621, p = 0.002833</w:t>
       </w:r>
     </w:p>
-    <w:bookmarkEnd w:id="36"/>
-    <w:bookmarkStart w:id="39" w:name="f-test"/>
+    <w:bookmarkEnd w:id="51"/>
+    <w:bookmarkStart w:id="54" w:name="f-test"/>
     <w:p>
       <w:pPr>
         <w:pStyle w:val="Heading2"/>
@@ -13477,7 +14756,7 @@
         <w:t xml:space="preserve">2.5 F-test</w:t>
       </w:r>
     </w:p>
-    <w:bookmarkStart w:id="37" w:name="X265c113142e89496fe8f19b978dc6d034e35599"/>
+    <w:bookmarkStart w:id="52" w:name="X265c113142e89496fe8f19b978dc6d034e35599"/>
     <w:p>
       <w:pPr>
         <w:pStyle w:val="Heading3"/>
@@ -14077,8 +15356,8 @@
         <w:t xml:space="preserve">first as a check.</w:t>
       </w:r>
     </w:p>
-    <w:bookmarkEnd w:id="37"/>
-    <w:bookmarkStart w:id="38" w:name="b-one-way-anova-f-test-plantgrowth"/>
+    <w:bookmarkEnd w:id="52"/>
+    <w:bookmarkStart w:id="53" w:name="b-one-way-anova-f-test-plantgrowth"/>
     <w:p>
       <w:pPr>
         <w:pStyle w:val="Heading3"/>
@@ -15211,9 +16490,9 @@
         <w:t xml:space="preserve"># scipy check:     F = 4.8461, p-value = 0.01591</w:t>
       </w:r>
     </w:p>
-    <w:bookmarkEnd w:id="38"/>
-    <w:bookmarkEnd w:id="39"/>
-    <w:bookmarkStart w:id="40" w:name="summary-of-results"/>
+    <w:bookmarkEnd w:id="53"/>
+    <w:bookmarkEnd w:id="54"/>
+    <w:bookmarkStart w:id="55" w:name="summary-of-results"/>
     <w:p>
       <w:pPr>
         <w:pStyle w:val="Heading2"/>
@@ -15758,9 +17037,9 @@
         </w:tc>
       </w:tr>
     </w:tbl>
-    <w:bookmarkEnd w:id="40"/>
-    <w:bookmarkEnd w:id="41"/>
-    <w:bookmarkStart w:id="48" w:name="Xcbf1c9987347595baef6fa00db78b6d0bc7e126"/>
+    <w:bookmarkEnd w:id="55"/>
+    <w:bookmarkEnd w:id="56"/>
+    <w:bookmarkStart w:id="63" w:name="Xcbf1c9987347595baef6fa00db78b6d0bc7e126"/>
     <w:p>
       <w:pPr>
         <w:pStyle w:val="Heading1"/>
@@ -15769,7 +17048,7 @@
         <w:t xml:space="preserve">Question 3 — Supervised vs Unsupervised Learning, and Clustering</w:t>
       </w:r>
     </w:p>
-    <w:bookmarkStart w:id="42" w:name="supervised-versus-unsupervised-learning"/>
+    <w:bookmarkStart w:id="57" w:name="supervised-versus-unsupervised-learning"/>
     <w:p>
       <w:pPr>
         <w:pStyle w:val="Heading2"/>
@@ -16318,8 +17597,8 @@
         <w:t xml:space="preserve">reinforcement learning sit between these two.</w:t>
       </w:r>
     </w:p>
-    <w:bookmarkEnd w:id="42"/>
-    <w:bookmarkStart w:id="43" w:name="example-data-1"/>
+    <w:bookmarkEnd w:id="57"/>
+    <w:bookmarkStart w:id="58" w:name="example-data-1"/>
     <w:p>
       <w:pPr>
         <w:pStyle w:val="Heading2"/>
@@ -16815,8 +18094,8 @@
         <w:t xml:space="preserve">(silhouette) used for evaluation.</w:t>
       </w:r>
     </w:p>
-    <w:bookmarkEnd w:id="43"/>
-    <w:bookmarkStart w:id="44" w:name="X179eba746ab6d5c3ac128ef8d0bd03c4e9fc6d9"/>
+    <w:bookmarkEnd w:id="58"/>
+    <w:bookmarkStart w:id="59" w:name="X179eba746ab6d5c3ac128ef8d0bd03c4e9fc6d9"/>
     <w:p>
       <w:pPr>
         <w:pStyle w:val="Heading2"/>
@@ -18251,8 +19530,8 @@
         <w:t xml:space="preserve">only hard assignments.</w:t>
       </w:r>
     </w:p>
-    <w:bookmarkEnd w:id="44"/>
-    <w:bookmarkStart w:id="45" w:name="X913585779a1d341d9596e63412d68ca7d6769a7"/>
+    <w:bookmarkEnd w:id="59"/>
+    <w:bookmarkStart w:id="60" w:name="X913585779a1d341d9596e63412d68ca7d6769a7"/>
     <w:p>
       <w:pPr>
         <w:pStyle w:val="Heading2"/>
@@ -18943,8 +20222,8 @@
         <w:t xml:space="preserve">not scale, which is why Spark offers the divisive version.</w:t>
       </w:r>
     </w:p>
-    <w:bookmarkEnd w:id="45"/>
-    <w:bookmarkStart w:id="46" w:name="X2ce020e51afe192ac7919f4fce6a84a42c03ba0"/>
+    <w:bookmarkEnd w:id="60"/>
+    <w:bookmarkStart w:id="61" w:name="X2ce020e51afe192ac7919f4fce6a84a42c03ba0"/>
     <w:p>
       <w:pPr>
         <w:pStyle w:val="Heading2"/>
@@ -21629,8 +22908,8 @@
         <w:t xml:space="preserve">Only 12 of the 272 eruptions fall between 2.5 and 3.5 minutes.</w:t>
       </w:r>
     </w:p>
-    <w:bookmarkEnd w:id="46"/>
-    <w:bookmarkStart w:id="47" w:name="comparison-of-the-three-algorithms"/>
+    <w:bookmarkEnd w:id="61"/>
+    <w:bookmarkStart w:id="62" w:name="comparison-of-the-three-algorithms"/>
     <w:p>
       <w:pPr>
         <w:pStyle w:val="Heading2"/>
@@ -22216,9 +23495,9 @@
         </w:tc>
       </w:tr>
     </w:tbl>
-    <w:bookmarkEnd w:id="47"/>
-    <w:bookmarkEnd w:id="48"/>
-    <w:bookmarkStart w:id="57" w:name="question-4-classification"/>
+    <w:bookmarkEnd w:id="62"/>
+    <w:bookmarkEnd w:id="63"/>
+    <w:bookmarkStart w:id="72" w:name="question-4-classification"/>
     <w:p>
       <w:pPr>
         <w:pStyle w:val="Heading1"/>
@@ -22227,7 +23506,7 @@
         <w:t xml:space="preserve">Question 4 — Classification</w:t>
       </w:r>
     </w:p>
-    <w:bookmarkStart w:id="49" w:name="what-is-classification"/>
+    <w:bookmarkStart w:id="64" w:name="what-is-classification"/>
     <w:p>
       <w:pPr>
         <w:pStyle w:val="Heading2"/>
@@ -22684,8 +23963,8 @@
         <w:t xml:space="preserve">value.</w:t>
       </w:r>
     </w:p>
-    <w:bookmarkEnd w:id="49"/>
-    <w:bookmarkStart w:id="50" w:name="the-three-algorithms-in-words"/>
+    <w:bookmarkEnd w:id="64"/>
+    <w:bookmarkStart w:id="65" w:name="the-three-algorithms-in-words"/>
     <w:p>
       <w:pPr>
         <w:pStyle w:val="Heading2"/>
@@ -23567,8 +24846,8 @@
         <w:t xml:space="preserve">the trees in parallel.</w:t>
       </w:r>
     </w:p>
-    <w:bookmarkEnd w:id="50"/>
-    <w:bookmarkStart w:id="54" w:name="X4345c8b277f643a60550f0be588914a124a8dcb"/>
+    <w:bookmarkEnd w:id="65"/>
+    <w:bookmarkStart w:id="69" w:name="X4345c8b277f643a60550f0be588914a124a8dcb"/>
     <w:p>
       <w:pPr>
         <w:pStyle w:val="Heading2"/>
@@ -23658,7 +24937,7 @@
         <w:t xml:space="preserve">.</w:t>
       </w:r>
     </w:p>
-    <w:bookmarkStart w:id="51" w:name="naïve-bayes-by-hand"/>
+    <w:bookmarkStart w:id="66" w:name="naïve-bayes-by-hand"/>
     <w:p>
       <w:pPr>
         <w:pStyle w:val="Heading3"/>
@@ -24040,8 +25319,8 @@
         <w:t xml:space="preserve">estimates towards uniform.</w:t>
       </w:r>
     </w:p>
-    <w:bookmarkEnd w:id="51"/>
-    <w:bookmarkStart w:id="52" w:name="Xcb85fe0513b613fe39a6a7ffdc18a2e1df7e738"/>
+    <w:bookmarkEnd w:id="66"/>
+    <w:bookmarkStart w:id="67" w:name="Xcb85fe0513b613fe39a6a7ffdc18a2e1df7e738"/>
     <w:p>
       <w:pPr>
         <w:pStyle w:val="Heading3"/>
@@ -24482,8 +25761,8 @@
         <w:t xml:space="preserve">probability is P(No) = 0.701, which agrees with Naïve Bayes.</w:t>
       </w:r>
     </w:p>
-    <w:bookmarkEnd w:id="52"/>
-    <w:bookmarkStart w:id="53" w:name="X45beb402c817aedc3676a82fa1843b48c1512a0"/>
+    <w:bookmarkEnd w:id="67"/>
+    <w:bookmarkStart w:id="68" w:name="X45beb402c817aedc3676a82fa1843b48c1512a0"/>
     <w:p>
       <w:pPr>
         <w:pStyle w:val="Heading3"/>
@@ -25615,9 +26894,9 @@
         <w:t xml:space="preserve">program that a textbook SVM uses.</w:t>
       </w:r>
     </w:p>
-    <w:bookmarkEnd w:id="53"/>
-    <w:bookmarkEnd w:id="54"/>
-    <w:bookmarkStart w:id="55" w:name="X8aff2694a97403ad868d47e7d922f6686357b34"/>
+    <w:bookmarkEnd w:id="68"/>
+    <w:bookmarkEnd w:id="69"/>
+    <w:bookmarkStart w:id="70" w:name="X8aff2694a97403ad868d47e7d922f6686357b34"/>
     <w:p>
       <w:pPr>
         <w:pStyle w:val="Heading2"/>
@@ -27831,8 +29110,8 @@
         <w:t xml:space="preserve">spam filter that must not lose real mail. The SVM sits in between.</w:t>
       </w:r>
     </w:p>
-    <w:bookmarkEnd w:id="55"/>
-    <w:bookmarkStart w:id="56" w:name="Xb8b92fef091e3130f00072f76df3a0000f23b08"/>
+    <w:bookmarkEnd w:id="70"/>
+    <w:bookmarkStart w:id="71" w:name="Xb8b92fef091e3130f00072f76df3a0000f23b08"/>
     <w:p>
       <w:pPr>
         <w:pStyle w:val="Heading2"/>
@@ -28737,9 +30016,625 @@
         </w:tc>
       </w:tr>
     </w:tbl>
-    <w:bookmarkEnd w:id="56"/>
-    <w:bookmarkEnd w:id="57"/>
-    <w:bookmarkStart w:id="58" w:name="references"/>
+    <w:bookmarkEnd w:id="71"/>
+    <w:bookmarkEnd w:id="72"/>
+    <w:bookmarkStart w:id="104" w:name="appendix-a-execution-screenshots"/>
+    <w:p>
+      <w:pPr>
+        <w:pStyle w:val="Heading1"/>
+      </w:pPr>
+      <w:r>
+        <w:t xml:space="preserve">Appendix A — Execution Screenshots</w:t>
+      </w:r>
+    </w:p>
+    <w:p>
+      <w:pPr>
+        <w:pStyle w:val="FirstParagraph"/>
+      </w:pPr>
+      <w:r>
+        <w:t xml:space="preserve">The figures below come from the</w:t>
+      </w:r>
+      <w:r>
+        <w:t xml:space="preserve"> </w:t>
+      </w:r>
+      <w:r>
+        <w:rPr>
+          <w:rStyle w:val="VerbatimChar"/>
+        </w:rPr>
+        <w:t xml:space="preserve">spark-submit</w:t>
+      </w:r>
+      <w:r>
+        <w:t xml:space="preserve"> </w:t>
+      </w:r>
+      <w:r>
+        <w:t xml:space="preserve">runs described in the Spark</w:t>
+      </w:r>
+      <w:r>
+        <w:t xml:space="preserve"> </w:t>
+      </w:r>
+      <w:r>
+        <w:t xml:space="preserve">Environment section. The terminal figures are excerpts of each program’s console</w:t>
+      </w:r>
+      <w:r>
+        <w:t xml:space="preserve"> </w:t>
+      </w:r>
+      <w:r>
+        <w:t xml:space="preserve">output;</w:t>
+      </w:r>
+      <w:r>
+        <w:t xml:space="preserve"> </w:t>
+      </w:r>
+      <w:r>
+        <w:t xml:space="preserve">“</w:t>
+      </w:r>
+      <w:r>
+        <w:t xml:space="preserve">…</w:t>
+      </w:r>
+      <w:r>
+        <w:t xml:space="preserve">”</w:t>
+      </w:r>
+      <w:r>
+        <w:t xml:space="preserve"> </w:t>
+      </w:r>
+      <w:r>
+        <w:t xml:space="preserve">marks lines left out to save space. The full output of each run is in</w:t>
+      </w:r>
+      <w:r>
+        <w:t xml:space="preserve"> </w:t>
+      </w:r>
+      <w:r>
+        <w:rPr>
+          <w:rStyle w:val="VerbatimChar"/>
+        </w:rPr>
+        <w:t xml:space="preserve">outputs/</w:t>
+      </w:r>
+      <w:r>
+        <w:t xml:space="preserve">. The Spark UI figures are from the Spark History Server, which reads each</w:t>
+      </w:r>
+      <w:r>
+        <w:t xml:space="preserve"> </w:t>
+      </w:r>
+      <w:r>
+        <w:t xml:space="preserve">run’s event log.</w:t>
+      </w:r>
+    </w:p>
+    <w:bookmarkStart w:id="79" w:name="question-1-similarity-measures-1"/>
+    <w:p>
+      <w:pPr>
+        <w:pStyle w:val="Heading2"/>
+      </w:pPr>
+      <w:r>
+        <w:t xml:space="preserve">Question 1 — Similarity measures</w:t>
+      </w:r>
+    </w:p>
+    <w:p>
+      <w:pPr>
+        <w:pStyle w:val="CaptionedFigure"/>
+      </w:pPr>
+      <w:r>
+        <w:drawing>
+          <wp:inline>
+            <wp:extent cx="5334000" cy="2706116"/>
+            <wp:effectExtent b="0" l="0" r="0" t="0"/>
+            <wp:docPr descr="Q1 console output (excerpt): MovieLens data loaded and the pairwise similarity table" title="" id="74" name="Picture"/>
+            <a:graphic>
+              <a:graphicData uri="http://schemas.openxmlformats.org/drawingml/2006/picture">
+                <pic:pic>
+                  <pic:nvPicPr>
+                    <pic:cNvPr descr="screenshots/11_console_q1.png" id="75" name="Picture"/>
+                    <pic:cNvPicPr>
+                      <a:picLocks noChangeArrowheads="1" noChangeAspect="1"/>
+                    </pic:cNvPicPr>
+                  </pic:nvPicPr>
+                  <pic:blipFill>
+                    <a:blip r:embed="rId73"/>
+                    <a:stretch>
+                      <a:fillRect/>
+                    </a:stretch>
+                  </pic:blipFill>
+                  <pic:spPr bwMode="auto">
+                    <a:xfrm>
+                      <a:off x="0" y="0"/>
+                      <a:ext cx="5334000" cy="2706116"/>
+                    </a:xfrm>
+                    <a:prstGeom prst="rect">
+                      <a:avLst/>
+                    </a:prstGeom>
+                    <a:noFill/>
+                    <a:ln w="9525">
+                      <a:noFill/>
+                      <a:headEnd/>
+                      <a:tailEnd/>
+                    </a:ln>
+                  </pic:spPr>
+                </pic:pic>
+              </a:graphicData>
+            </a:graphic>
+          </wp:inline>
+        </w:drawing>
+      </w:r>
+    </w:p>
+    <w:p>
+      <w:pPr>
+        <w:pStyle w:val="ImageCaption"/>
+      </w:pPr>
+      <w:r>
+        <w:t xml:space="preserve">Q1 console output (excerpt): MovieLens data loaded and the pairwise similarity table</w:t>
+      </w:r>
+    </w:p>
+    <w:p>
+      <w:pPr>
+        <w:pStyle w:val="CaptionedFigure"/>
+      </w:pPr>
+      <w:r>
+        <w:drawing>
+          <wp:inline>
+            <wp:extent cx="5334000" cy="4381500"/>
+            <wp:effectExtent b="0" l="0" r="0" t="0"/>
+            <wp:docPr descr="Q1 Spark jobs: 71 completed jobs in 3.4 minutes" title="" id="77" name="Picture"/>
+            <a:graphic>
+              <a:graphicData uri="http://schemas.openxmlformats.org/drawingml/2006/picture">
+                <pic:pic>
+                  <pic:nvPicPr>
+                    <pic:cNvPr descr="screenshots/02_q1_jobs.png" id="78" name="Picture"/>
+                    <pic:cNvPicPr>
+                      <a:picLocks noChangeArrowheads="1" noChangeAspect="1"/>
+                    </pic:cNvPicPr>
+                  </pic:nvPicPr>
+                  <pic:blipFill>
+                    <a:blip r:embed="rId76"/>
+                    <a:stretch>
+                      <a:fillRect/>
+                    </a:stretch>
+                  </pic:blipFill>
+                  <pic:spPr bwMode="auto">
+                    <a:xfrm>
+                      <a:off x="0" y="0"/>
+                      <a:ext cx="5334000" cy="4381500"/>
+                    </a:xfrm>
+                    <a:prstGeom prst="rect">
+                      <a:avLst/>
+                    </a:prstGeom>
+                    <a:noFill/>
+                    <a:ln w="9525">
+                      <a:noFill/>
+                      <a:headEnd/>
+                      <a:tailEnd/>
+                    </a:ln>
+                  </pic:spPr>
+                </pic:pic>
+              </a:graphicData>
+            </a:graphic>
+          </wp:inline>
+        </w:drawing>
+      </w:r>
+    </w:p>
+    <w:p>
+      <w:pPr>
+        <w:pStyle w:val="ImageCaption"/>
+      </w:pPr>
+      <w:r>
+        <w:t xml:space="preserve">Q1 Spark jobs: 71 completed jobs in 3.4 minutes</w:t>
+      </w:r>
+    </w:p>
+    <w:bookmarkEnd w:id="79"/>
+    <w:bookmarkStart w:id="86" w:name="question-2-hypothesis-testing-1"/>
+    <w:p>
+      <w:pPr>
+        <w:pStyle w:val="Heading2"/>
+      </w:pPr>
+      <w:r>
+        <w:t xml:space="preserve">Question 2 — Hypothesis testing</w:t>
+      </w:r>
+    </w:p>
+    <w:p>
+      <w:pPr>
+        <w:pStyle w:val="CaptionedFigure"/>
+      </w:pPr>
+      <w:r>
+        <w:drawing>
+          <wp:inline>
+            <wp:extent cx="5334000" cy="3548888"/>
+            <wp:effectExtent b="0" l="0" r="0" t="0"/>
+            <wp:docPr descr="Q2 console output (excerpt): chi-square, t-tests, F-test and ANOVA results" title="" id="81" name="Picture"/>
+            <a:graphic>
+              <a:graphicData uri="http://schemas.openxmlformats.org/drawingml/2006/picture">
+                <pic:pic>
+                  <pic:nvPicPr>
+                    <pic:cNvPr descr="screenshots/12_console_q2.png" id="82" name="Picture"/>
+                    <pic:cNvPicPr>
+                      <a:picLocks noChangeArrowheads="1" noChangeAspect="1"/>
+                    </pic:cNvPicPr>
+                  </pic:nvPicPr>
+                  <pic:blipFill>
+                    <a:blip r:embed="rId80"/>
+                    <a:stretch>
+                      <a:fillRect/>
+                    </a:stretch>
+                  </pic:blipFill>
+                  <pic:spPr bwMode="auto">
+                    <a:xfrm>
+                      <a:off x="0" y="0"/>
+                      <a:ext cx="5334000" cy="3548888"/>
+                    </a:xfrm>
+                    <a:prstGeom prst="rect">
+                      <a:avLst/>
+                    </a:prstGeom>
+                    <a:noFill/>
+                    <a:ln w="9525">
+                      <a:noFill/>
+                      <a:headEnd/>
+                      <a:tailEnd/>
+                    </a:ln>
+                  </pic:spPr>
+                </pic:pic>
+              </a:graphicData>
+            </a:graphic>
+          </wp:inline>
+        </w:drawing>
+      </w:r>
+    </w:p>
+    <w:p>
+      <w:pPr>
+        <w:pStyle w:val="ImageCaption"/>
+      </w:pPr>
+      <w:r>
+        <w:t xml:space="preserve">Q2 console output (excerpt): chi-square, t-tests, F-test and ANOVA results</w:t>
+      </w:r>
+    </w:p>
+    <w:p>
+      <w:pPr>
+        <w:pStyle w:val="CaptionedFigure"/>
+      </w:pPr>
+      <w:r>
+        <w:drawing>
+          <wp:inline>
+            <wp:extent cx="5334000" cy="4381500"/>
+            <wp:effectExtent b="0" l="0" r="0" t="0"/>
+            <wp:docPr descr="Q2 Spark jobs" title="" id="84" name="Picture"/>
+            <a:graphic>
+              <a:graphicData uri="http://schemas.openxmlformats.org/drawingml/2006/picture">
+                <pic:pic>
+                  <pic:nvPicPr>
+                    <pic:cNvPr descr="screenshots/05_q2_jobs.png" id="85" name="Picture"/>
+                    <pic:cNvPicPr>
+                      <a:picLocks noChangeArrowheads="1" noChangeAspect="1"/>
+                    </pic:cNvPicPr>
+                  </pic:nvPicPr>
+                  <pic:blipFill>
+                    <a:blip r:embed="rId83"/>
+                    <a:stretch>
+                      <a:fillRect/>
+                    </a:stretch>
+                  </pic:blipFill>
+                  <pic:spPr bwMode="auto">
+                    <a:xfrm>
+                      <a:off x="0" y="0"/>
+                      <a:ext cx="5334000" cy="4381500"/>
+                    </a:xfrm>
+                    <a:prstGeom prst="rect">
+                      <a:avLst/>
+                    </a:prstGeom>
+                    <a:noFill/>
+                    <a:ln w="9525">
+                      <a:noFill/>
+                      <a:headEnd/>
+                      <a:tailEnd/>
+                    </a:ln>
+                  </pic:spPr>
+                </pic:pic>
+              </a:graphicData>
+            </a:graphic>
+          </wp:inline>
+        </w:drawing>
+      </w:r>
+    </w:p>
+    <w:p>
+      <w:pPr>
+        <w:pStyle w:val="ImageCaption"/>
+      </w:pPr>
+      <w:r>
+        <w:t xml:space="preserve">Q2 Spark jobs</w:t>
+      </w:r>
+    </w:p>
+    <w:bookmarkEnd w:id="86"/>
+    <w:bookmarkStart w:id="93" w:name="question-3-clustering"/>
+    <w:p>
+      <w:pPr>
+        <w:pStyle w:val="Heading2"/>
+      </w:pPr>
+      <w:r>
+        <w:t xml:space="preserve">Question 3 — Clustering</w:t>
+      </w:r>
+    </w:p>
+    <w:p>
+      <w:pPr>
+        <w:pStyle w:val="CaptionedFigure"/>
+      </w:pPr>
+      <w:r>
+        <w:drawing>
+          <wp:inline>
+            <wp:extent cx="5334000" cy="2517648"/>
+            <wp:effectExtent b="0" l="0" r="0" t="0"/>
+            <wp:docPr descr="Q3 console output (excerpt): choosing k and the K-Means result on Iris" title="" id="88" name="Picture"/>
+            <a:graphic>
+              <a:graphicData uri="http://schemas.openxmlformats.org/drawingml/2006/picture">
+                <pic:pic>
+                  <pic:nvPicPr>
+                    <pic:cNvPr descr="screenshots/13_console_q3.png" id="89" name="Picture"/>
+                    <pic:cNvPicPr>
+                      <a:picLocks noChangeArrowheads="1" noChangeAspect="1"/>
+                    </pic:cNvPicPr>
+                  </pic:nvPicPr>
+                  <pic:blipFill>
+                    <a:blip r:embed="rId87"/>
+                    <a:stretch>
+                      <a:fillRect/>
+                    </a:stretch>
+                  </pic:blipFill>
+                  <pic:spPr bwMode="auto">
+                    <a:xfrm>
+                      <a:off x="0" y="0"/>
+                      <a:ext cx="5334000" cy="2517648"/>
+                    </a:xfrm>
+                    <a:prstGeom prst="rect">
+                      <a:avLst/>
+                    </a:prstGeom>
+                    <a:noFill/>
+                    <a:ln w="9525">
+                      <a:noFill/>
+                      <a:headEnd/>
+                      <a:tailEnd/>
+                    </a:ln>
+                  </pic:spPr>
+                </pic:pic>
+              </a:graphicData>
+            </a:graphic>
+          </wp:inline>
+        </w:drawing>
+      </w:r>
+    </w:p>
+    <w:p>
+      <w:pPr>
+        <w:pStyle w:val="ImageCaption"/>
+      </w:pPr>
+      <w:r>
+        <w:t xml:space="preserve">Q3 console output (excerpt): choosing k and the K-Means result on Iris</w:t>
+      </w:r>
+    </w:p>
+    <w:p>
+      <w:pPr>
+        <w:pStyle w:val="CaptionedFigure"/>
+      </w:pPr>
+      <w:r>
+        <w:drawing>
+          <wp:inline>
+            <wp:extent cx="5334000" cy="4381500"/>
+            <wp:effectExtent b="0" l="0" r="0" t="0"/>
+            <wp:docPr descr="Q3 Spark jobs" title="" id="91" name="Picture"/>
+            <a:graphic>
+              <a:graphicData uri="http://schemas.openxmlformats.org/drawingml/2006/picture">
+                <pic:pic>
+                  <pic:nvPicPr>
+                    <pic:cNvPr descr="screenshots/06_q3_jobs.png" id="92" name="Picture"/>
+                    <pic:cNvPicPr>
+                      <a:picLocks noChangeArrowheads="1" noChangeAspect="1"/>
+                    </pic:cNvPicPr>
+                  </pic:nvPicPr>
+                  <pic:blipFill>
+                    <a:blip r:embed="rId90"/>
+                    <a:stretch>
+                      <a:fillRect/>
+                    </a:stretch>
+                  </pic:blipFill>
+                  <pic:spPr bwMode="auto">
+                    <a:xfrm>
+                      <a:off x="0" y="0"/>
+                      <a:ext cx="5334000" cy="4381500"/>
+                    </a:xfrm>
+                    <a:prstGeom prst="rect">
+                      <a:avLst/>
+                    </a:prstGeom>
+                    <a:noFill/>
+                    <a:ln w="9525">
+                      <a:noFill/>
+                      <a:headEnd/>
+                      <a:tailEnd/>
+                    </a:ln>
+                  </pic:spPr>
+                </pic:pic>
+              </a:graphicData>
+            </a:graphic>
+          </wp:inline>
+        </w:drawing>
+      </w:r>
+    </w:p>
+    <w:p>
+      <w:pPr>
+        <w:pStyle w:val="ImageCaption"/>
+      </w:pPr>
+      <w:r>
+        <w:t xml:space="preserve">Q3 Spark jobs</w:t>
+      </w:r>
+    </w:p>
+    <w:bookmarkEnd w:id="93"/>
+    <w:bookmarkStart w:id="103" w:name="question-4-classification-1"/>
+    <w:p>
+      <w:pPr>
+        <w:pStyle w:val="Heading2"/>
+      </w:pPr>
+      <w:r>
+        <w:t xml:space="preserve">Question 4 — Classification</w:t>
+      </w:r>
+    </w:p>
+    <w:p>
+      <w:pPr>
+        <w:pStyle w:val="CaptionedFigure"/>
+      </w:pPr>
+      <w:r>
+        <w:drawing>
+          <wp:inline>
+            <wp:extent cx="5334000" cy="1863344"/>
+            <wp:effectExtent b="0" l="0" r="0" t="0"/>
+            <wp:docPr descr="Q4 console output (excerpt): Naive Bayes by hand and the test-set comparison" title="" id="95" name="Picture"/>
+            <a:graphic>
+              <a:graphicData uri="http://schemas.openxmlformats.org/drawingml/2006/picture">
+                <pic:pic>
+                  <pic:nvPicPr>
+                    <pic:cNvPr descr="screenshots/14_console_q4.png" id="96" name="Picture"/>
+                    <pic:cNvPicPr>
+                      <a:picLocks noChangeArrowheads="1" noChangeAspect="1"/>
+                    </pic:cNvPicPr>
+                  </pic:nvPicPr>
+                  <pic:blipFill>
+                    <a:blip r:embed="rId94"/>
+                    <a:stretch>
+                      <a:fillRect/>
+                    </a:stretch>
+                  </pic:blipFill>
+                  <pic:spPr bwMode="auto">
+                    <a:xfrm>
+                      <a:off x="0" y="0"/>
+                      <a:ext cx="5334000" cy="1863344"/>
+                    </a:xfrm>
+                    <a:prstGeom prst="rect">
+                      <a:avLst/>
+                    </a:prstGeom>
+                    <a:noFill/>
+                    <a:ln w="9525">
+                      <a:noFill/>
+                      <a:headEnd/>
+                      <a:tailEnd/>
+                    </a:ln>
+                  </pic:spPr>
+                </pic:pic>
+              </a:graphicData>
+            </a:graphic>
+          </wp:inline>
+        </w:drawing>
+      </w:r>
+    </w:p>
+    <w:p>
+      <w:pPr>
+        <w:pStyle w:val="ImageCaption"/>
+      </w:pPr>
+      <w:r>
+        <w:t xml:space="preserve">Q4 console output (excerpt): Naive Bayes by hand and the test-set comparison</w:t>
+      </w:r>
+    </w:p>
+    <w:p>
+      <w:pPr>
+        <w:pStyle w:val="CaptionedFigure"/>
+      </w:pPr>
+      <w:r>
+        <w:drawing>
+          <wp:inline>
+            <wp:extent cx="5334000" cy="4381500"/>
+            <wp:effectExtent b="0" l="0" r="0" t="0"/>
+            <wp:docPr descr="Q4 Spark jobs" title="" id="98" name="Picture"/>
+            <a:graphic>
+              <a:graphicData uri="http://schemas.openxmlformats.org/drawingml/2006/picture">
+                <pic:pic>
+                  <pic:nvPicPr>
+                    <pic:cNvPr descr="screenshots/07_q4_jobs.png" id="99" name="Picture"/>
+                    <pic:cNvPicPr>
+                      <a:picLocks noChangeArrowheads="1" noChangeAspect="1"/>
+                    </pic:cNvPicPr>
+                  </pic:nvPicPr>
+                  <pic:blipFill>
+                    <a:blip r:embed="rId97"/>
+                    <a:stretch>
+                      <a:fillRect/>
+                    </a:stretch>
+                  </pic:blipFill>
+                  <pic:spPr bwMode="auto">
+                    <a:xfrm>
+                      <a:off x="0" y="0"/>
+                      <a:ext cx="5334000" cy="4381500"/>
+                    </a:xfrm>
+                    <a:prstGeom prst="rect">
+                      <a:avLst/>
+                    </a:prstGeom>
+                    <a:noFill/>
+                    <a:ln w="9525">
+                      <a:noFill/>
+                      <a:headEnd/>
+                      <a:tailEnd/>
+                    </a:ln>
+                  </pic:spPr>
+                </pic:pic>
+              </a:graphicData>
+            </a:graphic>
+          </wp:inline>
+        </w:drawing>
+      </w:r>
+    </w:p>
+    <w:p>
+      <w:pPr>
+        <w:pStyle w:val="ImageCaption"/>
+      </w:pPr>
+      <w:r>
+        <w:t xml:space="preserve">Q4 Spark jobs</w:t>
+      </w:r>
+    </w:p>
+    <w:p>
+      <w:pPr>
+        <w:pStyle w:val="CaptionedFigure"/>
+      </w:pPr>
+      <w:r>
+        <w:drawing>
+          <wp:inline>
+            <wp:extent cx="5334000" cy="4381500"/>
+            <wp:effectExtent b="0" l="0" r="0" t="0"/>
+            <wp:docPr descr="Q4 SQL / DataFrame queries executed by Spark" title="" id="101" name="Picture"/>
+            <a:graphic>
+              <a:graphicData uri="http://schemas.openxmlformats.org/drawingml/2006/picture">
+                <pic:pic>
+                  <pic:nvPicPr>
+                    <pic:cNvPr descr="screenshots/08_q4_sql.png" id="102" name="Picture"/>
+                    <pic:cNvPicPr>
+                      <a:picLocks noChangeArrowheads="1" noChangeAspect="1"/>
+                    </pic:cNvPicPr>
+                  </pic:nvPicPr>
+                  <pic:blipFill>
+                    <a:blip r:embed="rId100"/>
+                    <a:stretch>
+                      <a:fillRect/>
+                    </a:stretch>
+                  </pic:blipFill>
+                  <pic:spPr bwMode="auto">
+                    <a:xfrm>
+                      <a:off x="0" y="0"/>
+                      <a:ext cx="5334000" cy="4381500"/>
+                    </a:xfrm>
+                    <a:prstGeom prst="rect">
+                      <a:avLst/>
+                    </a:prstGeom>
+                    <a:noFill/>
+                    <a:ln w="9525">
+                      <a:noFill/>
+                      <a:headEnd/>
+                      <a:tailEnd/>
+                    </a:ln>
+                  </pic:spPr>
+                </pic:pic>
+              </a:graphicData>
+            </a:graphic>
+          </wp:inline>
+        </w:drawing>
+      </w:r>
+    </w:p>
+    <w:p>
+      <w:pPr>
+        <w:pStyle w:val="ImageCaption"/>
+      </w:pPr>
+      <w:r>
+        <w:t xml:space="preserve">Q4 SQL / DataFrame queries executed by Spark</w:t>
+      </w:r>
+    </w:p>
+    <w:bookmarkEnd w:id="103"/>
+    <w:bookmarkEnd w:id="104"/>
+    <w:bookmarkStart w:id="105" w:name="references"/>
     <w:p>
       <w:pPr>
         <w:pStyle w:val="Heading1"/>
@@ -29766,7 +31661,7 @@
         <w:t xml:space="preserve">attribute is omitted here.)</w:t>
       </w:r>
     </w:p>
-    <w:bookmarkEnd w:id="58"/>
+    <w:bookmarkEnd w:id="105"/>
     <w:sectPr/>
   </w:body>
 </w:document>

</xml_diff>